<commit_message>
Convert manuscript to CHEERS-style research article
</commit_message>
<xml_diff>
--- a/submission_package/supplementary_materials/technical_appendix.docx
+++ b/submission_package/supplementary_materials/technical_appendix.docx
@@ -1922,6 +1922,47 @@
     <w:p>
       <w:pPr>
         <w:pStyle w:val="FirstParagraph"/>
+      </w:pPr>
+      <w:r>
+        <w:t xml:space="preserve">Intervention costs are expressed in</w:t>
+      </w:r>
+      <w:r>
+        <w:t xml:space="preserve"> </w:t>
+      </w:r>
+      <w:r>
+        <w:rPr>
+          <w:rStyle w:val="VerbatimChar"/>
+        </w:rPr>
+        <w:t xml:space="preserve">2026</w:t>
+      </w:r>
+      <w:r>
+        <w:t xml:space="preserve"> </w:t>
+      </w:r>
+      <w:r>
+        <w:t xml:space="preserve">US dollars. By contrast, the</w:t>
+      </w:r>
+      <w:r>
+        <w:t xml:space="preserve"> </w:t>
+      </w:r>
+      <w:r>
+        <w:t xml:space="preserve">productivity anchor for lifetime earnings is based on PPP GDP per</w:t>
+      </w:r>
+      <w:r>
+        <w:t xml:space="preserve"> </w:t>
+      </w:r>
+      <w:r>
+        <w:t xml:space="preserve">capita multiplied by labour’s share of national income, as described in</w:t>
+      </w:r>
+      <w:r>
+        <w:t xml:space="preserve"> </w:t>
+      </w:r>
+      <w:r>
+        <w:t xml:space="preserve">Section 3.</w:t>
+      </w:r>
+    </w:p>
+    <w:p>
+      <w:pPr>
+        <w:pStyle w:val="BodyText"/>
       </w:pPr>
       <w:r>
         <w:t xml:space="preserve">The district overhead is modeled as:</w:t>

</xml_diff>